<commit_message>
doc processing refactored daoly report - locality added
</commit_message>
<xml_diff>
--- a/resources/templates/daily-report/СЗЧ.docx
+++ b/resources/templates/daily-report/СЗЧ.docx
@@ -819,6 +819,82 @@
                 <w:lang w:val="en-US"/>
               </w:rPr>
               <w:t>doc.des_region</w:t>
+            </w:r>
+            <w:proofErr w:type="spellEnd"/>
+            <w:r>
+              <w:rPr>
+                <w:rFonts w:ascii="Times New Roman" w:hAnsi="Times New Roman" w:cs="Times New Roman"/>
+                <w:iCs/>
+                <w:sz w:val="24"/>
+                <w:szCs w:val="24"/>
+                <w:lang w:val="en-US"/>
+              </w:rPr>
+              <w:t>}}</w:t>
+            </w:r>
+          </w:p>
+          <w:p>
+            <w:pPr>
+              <w:jc w:val="center"/>
+              <w:rPr>
+                <w:rFonts w:ascii="Times New Roman" w:hAnsi="Times New Roman" w:cs="Times New Roman"/>
+                <w:iCs/>
+                <w:sz w:val="24"/>
+                <w:szCs w:val="24"/>
+                <w:lang w:val="en-US"/>
+              </w:rPr>
+            </w:pPr>
+            <w:proofErr w:type="spellStart"/>
+            <w:r>
+              <w:rPr>
+                <w:rFonts w:ascii="Times New Roman" w:hAnsi="Times New Roman" w:cs="Times New Roman"/>
+                <w:iCs/>
+                <w:sz w:val="24"/>
+                <w:szCs w:val="24"/>
+                <w:lang w:val="uk-UA"/>
+              </w:rPr>
+              <w:t>н</w:t>
+            </w:r>
+            <w:r>
+              <w:rPr>
+                <w:rFonts w:ascii="Times New Roman" w:hAnsi="Times New Roman" w:cs="Times New Roman"/>
+                <w:iCs/>
+                <w:sz w:val="24"/>
+                <w:szCs w:val="24"/>
+                <w:lang w:val="uk-UA"/>
+              </w:rPr>
+              <w:t>.п</w:t>
+            </w:r>
+            <w:proofErr w:type="spellEnd"/>
+            <w:r>
+              <w:rPr>
+                <w:rFonts w:ascii="Times New Roman" w:hAnsi="Times New Roman" w:cs="Times New Roman"/>
+                <w:iCs/>
+                <w:sz w:val="24"/>
+                <w:szCs w:val="24"/>
+                <w:lang w:val="uk-UA"/>
+              </w:rPr>
+              <w:t xml:space="preserve">. </w:t>
+            </w:r>
+            <w:r>
+              <w:rPr>
+                <w:rFonts w:ascii="Times New Roman" w:hAnsi="Times New Roman" w:cs="Times New Roman"/>
+                <w:iCs/>
+                <w:sz w:val="24"/>
+                <w:szCs w:val="24"/>
+                <w:lang w:val="en-US"/>
+              </w:rPr>
+              <w:t>{{</w:t>
+            </w:r>
+            <w:proofErr w:type="spellStart"/>
+            <w:r>
+              <w:rPr>
+                <w:rFonts w:ascii="Times New Roman" w:hAnsi="Times New Roman" w:cs="Times New Roman"/>
+                <w:iCs/>
+                <w:sz w:val="24"/>
+                <w:szCs w:val="24"/>
+                <w:lang w:val="en-US"/>
+              </w:rPr>
+              <w:t>doc.des_locality</w:t>
             </w:r>
             <w:proofErr w:type="spellEnd"/>
             <w:r>

</xml_diff>

<commit_message>
mobile version for task and calendar
</commit_message>
<xml_diff>
--- a/resources/templates/daily-report/СЗЧ.docx
+++ b/resources/templates/daily-report/СЗЧ.docx
@@ -223,8 +223,8 @@
         <w:tblLook w:val="04A0" w:firstRow="1" w:lastRow="0" w:firstColumn="1" w:lastColumn="0" w:noHBand="0" w:noVBand="1"/>
       </w:tblPr>
       <w:tblGrid>
-        <w:gridCol w:w="1582"/>
-        <w:gridCol w:w="769"/>
+        <w:gridCol w:w="952"/>
+        <w:gridCol w:w="1399"/>
         <w:gridCol w:w="2890"/>
         <w:gridCol w:w="3120"/>
         <w:gridCol w:w="2971"/>
@@ -237,7 +237,7 @@
         </w:trPr>
         <w:tc>
           <w:tcPr>
-            <w:tcW w:w="1582" w:type="dxa"/>
+            <w:tcW w:w="952" w:type="dxa"/>
             <w:vAlign w:val="center"/>
           </w:tcPr>
           <w:p>
@@ -291,7 +291,7 @@
         </w:tc>
         <w:tc>
           <w:tcPr>
-            <w:tcW w:w="769" w:type="dxa"/>
+            <w:tcW w:w="1399" w:type="dxa"/>
             <w:vAlign w:val="center"/>
           </w:tcPr>
           <w:p>
@@ -476,7 +476,7 @@
         </w:trPr>
         <w:tc>
           <w:tcPr>
-            <w:tcW w:w="1582" w:type="dxa"/>
+            <w:tcW w:w="952" w:type="dxa"/>
             <w:vAlign w:val="center"/>
           </w:tcPr>
           <w:p>
@@ -532,7 +532,7 @@
         </w:tc>
         <w:tc>
           <w:tcPr>
-            <w:tcW w:w="769" w:type="dxa"/>
+            <w:tcW w:w="1399" w:type="dxa"/>
             <w:vAlign w:val="center"/>
           </w:tcPr>
           <w:p>
@@ -630,7 +630,7 @@
         </w:trPr>
         <w:tc>
           <w:tcPr>
-            <w:tcW w:w="1582" w:type="dxa"/>
+            <w:tcW w:w="952" w:type="dxa"/>
             <w:vAlign w:val="center"/>
           </w:tcPr>
           <w:p>
@@ -654,7 +654,7 @@
         </w:tc>
         <w:tc>
           <w:tcPr>
-            <w:tcW w:w="769" w:type="dxa"/>
+            <w:tcW w:w="1399" w:type="dxa"/>
             <w:vAlign w:val="center"/>
           </w:tcPr>
           <w:p>
@@ -955,7 +955,7 @@
         </w:trPr>
         <w:tc>
           <w:tcPr>
-            <w:tcW w:w="1582" w:type="dxa"/>
+            <w:tcW w:w="952" w:type="dxa"/>
             <w:vAlign w:val="center"/>
           </w:tcPr>
           <w:p>
@@ -983,7 +983,7 @@
         </w:tc>
         <w:tc>
           <w:tcPr>
-            <w:tcW w:w="769" w:type="dxa"/>
+            <w:tcW w:w="1399" w:type="dxa"/>
             <w:vAlign w:val="center"/>
           </w:tcPr>
           <w:p>

</xml_diff>